<commit_message>
Improve architecture diagram clarity and size for better readability
Update `generate_architecture_doc.py` to increase figure size, font sizes, and padding in the architecture diagram, also updating the `.agents/agent_assets_metadata.toml` file.

Replit-Commit-Author: Agent
Replit-Commit-Session-Id: b53fded6-c78f-4e6c-84d6-a0d930aa07e5
Replit-Commit-Checkpoint-Type: full_checkpoint
Replit-Commit-Event-Id: de280080-b6ab-465d-b089-66b5e3078ff6
Replit-Commit-Screenshot-Url: https://storage.googleapis.com/screenshot-production-us-central1/8eaa45a3-5daf-4c6a-923e-29a09dc86423/b53fded6-c78f-4e6c-84d6-a0d930aa07e5/9ujkb5T
Replit-Helium-Checkpoint-Created: true
</commit_message>
<xml_diff>
--- a/Dynamo_AI_Architecture_Paper.docx
+++ b/Dynamo_AI_Architecture_Paper.docx
@@ -212,7 +212,7 @@
       <w:r>
         <w:drawing>
           <wp:inline xmlns:a="http://schemas.openxmlformats.org/drawingml/2006/main" xmlns:pic="http://schemas.openxmlformats.org/drawingml/2006/picture">
-            <wp:extent cx="5943600" cy="4302855"/>
+            <wp:extent cx="5943600" cy="4253877"/>
             <wp:docPr id="1" name="Picture 1"/>
             <wp:cNvGraphicFramePr>
               <a:graphicFrameLocks noChangeAspect="1"/>
@@ -233,7 +233,7 @@
                   <pic:spPr>
                     <a:xfrm>
                       <a:off x="0" y="0"/>
-                      <a:ext cx="5943600" cy="4302855"/>
+                      <a:ext cx="5943600" cy="4253877"/>
                     </a:xfrm>
                     <a:prstGeom prst="rect"/>
                   </pic:spPr>

</xml_diff>